<commit_message>
Add fourth group member Mahmoud El-Serwy
Update author list across the hub page, README, the refreshed downloads (report, deck, PDFs), and the interactive presentation copy.

Co-Authored-By: Claude Opus 4.8 (1M context) <noreply@anthropic.com>
</commit_message>
<xml_diff>
--- a/downloads/Assignment1_Banking_IT_Impact.docx
+++ b/downloads/Assignment1_Banking_IT_Impact.docx
@@ -118,10 +118,10 @@
           <w:b/>
           <w:bCs/>
           <w:color w:val="10243F"/>
-          <w:sz w:val="26"/>
-          <w:szCs w:val="26"/>
+          <w:sz w:val="24"/>
+          <w:szCs w:val="24"/>
         </w:rPr>
-        <w:t xml:space="preserve">Ahmed Awad   |   Tariq Salama   |   Ahmed Sabri</w:t>
+        <w:t xml:space="preserve">Ahmed Awad   |   Tariq Salama   |   Ahmed Sabri   |   Mahmoud El-Serwy</w:t>
       </w:r>
     </w:p>
     <w:p>
@@ -1737,7 +1737,7 @@
       <w:r>
         <w:t xml:space="preserve">American Enterprise Institute. (n.d.). What ATMs and bank tellers reveal about the rise of the robots and jobs. </w:t>
       </w:r>
-      <w:hyperlink w:history="1" r:id="rIdxa6hw8xqwnadto9pxupdx">
+      <w:hyperlink w:history="1" r:id="rIdyozdcbmb-nzstjgcxrv0w">
         <w:r>
           <w:rPr>
             <w:rStyle w:val="Hyperlink"/>
@@ -1756,7 +1756,7 @@
       <w:r>
         <w:t xml:space="preserve">Burning Glass Institute. (n.d.). The case of the vanishing teller: How banking's entry-level jobs are transforming. </w:t>
       </w:r>
-      <w:hyperlink w:history="1" r:id="rId9jb3woxdik4pvlihfwm1z">
+      <w:hyperlink w:history="1" r:id="rIdzakiekfs6l_jkxb3oa7ci">
         <w:r>
           <w:rPr>
             <w:rStyle w:val="Hyperlink"/>
@@ -1775,7 +1775,7 @@
       <w:r>
         <w:t xml:space="preserve">CoinLaw. (2026). Bank branch closure statistics 2026: Global closures now. </w:t>
       </w:r>
-      <w:hyperlink w:history="1" r:id="rIdwqpq7yuvhjrvfpnwhfhk_">
+      <w:hyperlink w:history="1" r:id="rIdfpmf8--yom8alxo-4a99i">
         <w:r>
           <w:rPr>
             <w:rStyle w:val="Hyperlink"/>
@@ -1794,7 +1794,7 @@
       <w:r>
         <w:t xml:space="preserve">Daily News Egypt. (2025, November 17). CBE's digital transformation push lifts financial inclusion to 76.3% in June 2025. </w:t>
       </w:r>
-      <w:hyperlink w:history="1" r:id="rId7b-s9-8tvr0ppq8tvniwp">
+      <w:hyperlink w:history="1" r:id="rIdooep_45b0ovd1wvybm0qi">
         <w:r>
           <w:rPr>
             <w:rStyle w:val="Hyperlink"/>
@@ -1813,7 +1813,7 @@
       <w:r>
         <w:t xml:space="preserve">Federal Deposit Insurance Corporation. (n.d.). BankFind suite: Bank structure changes. </w:t>
       </w:r>
-      <w:hyperlink w:history="1" r:id="rIdn9ox1js_tlhavnlzkzrs3">
+      <w:hyperlink w:history="1" r:id="rId4ftgcgvoz1imqj4-mmv_k">
         <w:r>
           <w:rPr>
             <w:rStyle w:val="Hyperlink"/>
@@ -1832,7 +1832,7 @@
       <w:r>
         <w:t xml:space="preserve">S&amp;P Global Market Intelligence. (2025, May). Pace of US bank branch closures picks up in Q1 2025. </w:t>
       </w:r>
-      <w:hyperlink w:history="1" r:id="rIddrrdyyeqhm3iny127vzjk">
+      <w:hyperlink w:history="1" r:id="rIdlpcu2__4kzcrob-qanrml">
         <w:r>
           <w:rPr>
             <w:rStyle w:val="Hyperlink"/>
@@ -1851,7 +1851,7 @@
       <w:r>
         <w:t xml:space="preserve">U.S. Bureau of Labor Statistics. (n.d.). Tellers: Occupational outlook handbook. </w:t>
       </w:r>
-      <w:hyperlink w:history="1" r:id="rIdbwcefl-asqlkv9pmyohlh">
+      <w:hyperlink w:history="1" r:id="rIdldtffdtyb9ufklhd8emmk">
         <w:r>
           <w:rPr>
             <w:rStyle w:val="Hyperlink"/>
@@ -1870,7 +1870,7 @@
       <w:r>
         <w:t xml:space="preserve">World Economic Forum. (2025, January). The future of jobs report 2025. </w:t>
       </w:r>
-      <w:hyperlink w:history="1" r:id="rIdvpe1rjyrha6hqsnvd5bgn">
+      <w:hyperlink w:history="1" r:id="rIds4wucujssxagdj-ddakmf">
         <w:r>
           <w:rPr>
             <w:rStyle w:val="Hyperlink"/>
@@ -1889,7 +1889,7 @@
       <w:r>
         <w:t xml:space="preserve">Zawya. (2025). Central Bank of Egypt's digital transformation push lifts financial inclusion to 76.3% in June 2025. </w:t>
       </w:r>
-      <w:hyperlink w:history="1" r:id="rIdpf5aecvl6e9e2ax5jn0hq">
+      <w:hyperlink w:history="1" r:id="rId2dhxi6yvej7rpuievyihs">
         <w:r>
           <w:rPr>
             <w:rStyle w:val="Hyperlink"/>

</xml_diff>

<commit_message>
Rename group member Mahmoud El-Serwy to Mahmoud Ibrahim across all deliverables
- web: lecture-2 portal + presentation, lecture-1 hub + NBE deck
- downloads: rebuilt Ch5 deck, NBE deck, banking report (+ PDFs) with corrected name

Co-Authored-By: Claude Opus 4.8 (1M context) <noreply@anthropic.com>
</commit_message>
<xml_diff>
--- a/downloads/Assignment1_Banking_IT_Impact.docx
+++ b/downloads/Assignment1_Banking_IT_Impact.docx
@@ -121,7 +121,7 @@
           <w:sz w:val="24"/>
           <w:szCs w:val="24"/>
         </w:rPr>
-        <w:t xml:space="preserve">Ahmed Awad   |   Tariq Salama   |   Ahmed Sabri   |   Mahmoud El-Serwy</w:t>
+        <w:t xml:space="preserve">Ahmed Awad   |   Tariq Salama   |   Ahmed Sabri   |   Mahmoud Ibrahim</w:t>
       </w:r>
     </w:p>
     <w:p>
@@ -1737,7 +1737,7 @@
       <w:r>
         <w:t xml:space="preserve">American Enterprise Institute. (n.d.). What ATMs and bank tellers reveal about the rise of the robots and jobs. </w:t>
       </w:r>
-      <w:hyperlink w:history="1" r:id="rIdyozdcbmb-nzstjgcxrv0w">
+      <w:hyperlink w:history="1" r:id="rId9_id4tcnnvsfrfhpmga42">
         <w:r>
           <w:rPr>
             <w:rStyle w:val="Hyperlink"/>
@@ -1756,7 +1756,7 @@
       <w:r>
         <w:t xml:space="preserve">Burning Glass Institute. (n.d.). The case of the vanishing teller: How banking's entry-level jobs are transforming. </w:t>
       </w:r>
-      <w:hyperlink w:history="1" r:id="rIdzakiekfs6l_jkxb3oa7ci">
+      <w:hyperlink w:history="1" r:id="rId5_qptvgcj3cpx-j9pgbs0">
         <w:r>
           <w:rPr>
             <w:rStyle w:val="Hyperlink"/>
@@ -1775,7 +1775,7 @@
       <w:r>
         <w:t xml:space="preserve">CoinLaw. (2026). Bank branch closure statistics 2026: Global closures now. </w:t>
       </w:r>
-      <w:hyperlink w:history="1" r:id="rIdfpmf8--yom8alxo-4a99i">
+      <w:hyperlink w:history="1" r:id="rIdvwnfkcwd85ygpcqdi2fhp">
         <w:r>
           <w:rPr>
             <w:rStyle w:val="Hyperlink"/>
@@ -1794,7 +1794,7 @@
       <w:r>
         <w:t xml:space="preserve">Daily News Egypt. (2025, November 17). CBE's digital transformation push lifts financial inclusion to 76.3% in June 2025. </w:t>
       </w:r>
-      <w:hyperlink w:history="1" r:id="rIdooep_45b0ovd1wvybm0qi">
+      <w:hyperlink w:history="1" r:id="rIdkn70ciauqij8skalm4pxp">
         <w:r>
           <w:rPr>
             <w:rStyle w:val="Hyperlink"/>
@@ -1813,7 +1813,7 @@
       <w:r>
         <w:t xml:space="preserve">Federal Deposit Insurance Corporation. (n.d.). BankFind suite: Bank structure changes. </w:t>
       </w:r>
-      <w:hyperlink w:history="1" r:id="rId4ftgcgvoz1imqj4-mmv_k">
+      <w:hyperlink w:history="1" r:id="rIdsqo1irymnzk-tvds7jjmc">
         <w:r>
           <w:rPr>
             <w:rStyle w:val="Hyperlink"/>
@@ -1832,7 +1832,7 @@
       <w:r>
         <w:t xml:space="preserve">S&amp;P Global Market Intelligence. (2025, May). Pace of US bank branch closures picks up in Q1 2025. </w:t>
       </w:r>
-      <w:hyperlink w:history="1" r:id="rIdlpcu2__4kzcrob-qanrml">
+      <w:hyperlink w:history="1" r:id="rIdzovwivfa_i1kxy2ol1lpl">
         <w:r>
           <w:rPr>
             <w:rStyle w:val="Hyperlink"/>
@@ -1851,7 +1851,7 @@
       <w:r>
         <w:t xml:space="preserve">U.S. Bureau of Labor Statistics. (n.d.). Tellers: Occupational outlook handbook. </w:t>
       </w:r>
-      <w:hyperlink w:history="1" r:id="rIdldtffdtyb9ufklhd8emmk">
+      <w:hyperlink w:history="1" r:id="rIdvb5ijus3h81gxw5n5la8j">
         <w:r>
           <w:rPr>
             <w:rStyle w:val="Hyperlink"/>
@@ -1870,7 +1870,7 @@
       <w:r>
         <w:t xml:space="preserve">World Economic Forum. (2025, January). The future of jobs report 2025. </w:t>
       </w:r>
-      <w:hyperlink w:history="1" r:id="rIds4wucujssxagdj-ddakmf">
+      <w:hyperlink w:history="1" r:id="rIdxsmtooc6gz22mf7nvjlg-">
         <w:r>
           <w:rPr>
             <w:rStyle w:val="Hyperlink"/>
@@ -1889,7 +1889,7 @@
       <w:r>
         <w:t xml:space="preserve">Zawya. (2025). Central Bank of Egypt's digital transformation push lifts financial inclusion to 76.3% in June 2025. </w:t>
       </w:r>
-      <w:hyperlink w:history="1" r:id="rId2dhxi6yvej7rpuievyihs">
+      <w:hyperlink w:history="1" r:id="rId9qhappj91bpacduk-ftbf">
         <w:r>
           <w:rPr>
             <w:rStyle w:val="Hyperlink"/>

</xml_diff>